<commit_message>
FIXES-ZK: fewer architect icons (paths and actives only)
Co-Authored-By: Claude Opus 5.5 <noreply@anthropic.com>
Claude-Session: https://claude.ai/code/session_01YCWNLtj9zFsogxZeNiDKcG
</commit_message>
<xml_diff>
--- a/Арт-промпты.docx
+++ b/Арт-промпты.docx
@@ -17,7 +17,7 @@
     </w:p>
     <w:p>
       <w:r>
-        <w:t>Всего 10 генераций: 1 вещь, 1 лист глифов, 6 листов иконок, 1 лист эффектов. Во всех листах ячейки одинаковые и квадратные, между ними пустое место.</w:t>
+        <w:t>Всего 6 генераций: 1 вещь, 1 лист глифов, 2 листа иконок архитектов, 1 лист Страйдеров, 1 лист эффектов. Во всех листах ячейки одинаковые и квадратные, между ними пустое место.</w:t>
       </w:r>
     </w:p>
     <w:p>
@@ -99,12 +99,12 @@
         <w:pStyle w:val="Heading1"/>
       </w:pPr>
       <w:r>
-        <w:t>3. Иконки путей архитектов</w:t>
+        <w:t>3. Иконки архитектов — пути для выбора и активки (2 листа)</w:t>
       </w:r>
     </w:p>
     <w:p>
       <w:r>
-        <w:t>Общий стиль у всех листов — как у прежних иконок мода (в стиле иконок Ideology). Он уже вписан в каждый промпт.</w:t>
+        <w:t>Пассивки иконок не получают: на созвездии вместо них камни.</w:t>
       </w:r>
     </w:p>
     <w:p>
@@ -112,100 +112,7 @@
         <w:pStyle w:val="Heading2"/>
       </w:pPr>
       <w:r>
-        <w:t>3.1. Архконструкт (лист 3×2)</w:t>
-      </w:r>
-    </w:p>
-    <w:p>
-      <w:pPr>
-        <w:ind w:left="240"/>
-      </w:pPr>
-      <w:r>
-        <w:rPr>
-          <w:rFonts w:ascii="Consolas" w:hAnsi="Consolas"/>
-          <w:color w:val="202050"/>
-          <w:sz w:val="19"/>
-        </w:rPr>
-        <w:t>A sprite sheet of six separate game ability icons, in a grid of 3 columns and 2 rows, each icon alone in its own equal square cell with clear empty space between cells, on a plain flat medium grey background. STYLE: exactly like RimWorld Ideology ability icons - solid filled heavy shapes with real mass, soft cel shading in three tones, muted slightly dusty colours, no gloss, one very thick black outline around the outer silhouette only, almost no inner lines, compact chunky proportions, each symbol fills about 85 percent of its cell, no texture, no fine detail, readable at 32 pixels. No text, no labels, no grid lines.</w:t>
-        <w:br/>
-      </w:r>
-      <w:r>
-        <w:rPr>
-          <w:rFonts w:ascii="Consolas" w:hAnsi="Consolas"/>
-          <w:color w:val="202050"/>
-          <w:sz w:val="19"/>
-        </w:rPr>
-        <w:t>Top row, left to right:</w:t>
-        <w:br/>
-      </w:r>
-      <w:r>
-        <w:rPr>
-          <w:rFonts w:ascii="Consolas" w:hAnsi="Consolas"/>
-          <w:color w:val="202050"/>
-          <w:sz w:val="19"/>
-        </w:rPr>
-        <w:t>1. Emblem of the path: a heavy cog wheel with a small glowing pale-blue crystal orb at its hub - steel grey, worn bronze, pale blue.</w:t>
-        <w:br/>
-      </w:r>
-      <w:r>
-        <w:rPr>
-          <w:rFonts w:ascii="Consolas" w:hAnsi="Consolas"/>
-          <w:color w:val="202050"/>
-          <w:sz w:val="19"/>
-        </w:rPr>
-        <w:t>2. A sturdy wrench crossed with a mechanical claw arm, a soft amber glow between them - steel grey, amber.</w:t>
-        <w:br/>
-      </w:r>
-      <w:r>
-        <w:rPr>
-          <w:rFonts w:ascii="Consolas" w:hAnsi="Consolas"/>
-          <w:color w:val="202050"/>
-          <w:sz w:val="19"/>
-        </w:rPr>
-        <w:t>3. A lattice of glowing lines in a diamond net, with a small mechanical head inside it - pale blue lines, steel grey.</w:t>
-        <w:br/>
-      </w:r>
-      <w:r>
-        <w:rPr>
-          <w:rFonts w:ascii="Consolas" w:hAnsi="Consolas"/>
-          <w:color w:val="202050"/>
-          <w:sz w:val="19"/>
-        </w:rPr>
-        <w:t>Bottom row, left to right:</w:t>
-        <w:br/>
-      </w:r>
-      <w:r>
-        <w:rPr>
-          <w:rFonts w:ascii="Consolas" w:hAnsi="Consolas"/>
-          <w:color w:val="202050"/>
-          <w:sz w:val="19"/>
-        </w:rPr>
-        <w:t>4. A mechanical heart made of plates and rivets, glowing amber in its core - bronze, amber, dark grey.</w:t>
-        <w:br/>
-      </w:r>
-      <w:r>
-        <w:rPr>
-          <w:rFonts w:ascii="Consolas" w:hAnsi="Consolas"/>
-          <w:color w:val="202050"/>
-          <w:sz w:val="19"/>
-        </w:rPr>
-        <w:t>5. The same diamond lattice but broken open and spreading outward in rays - pale blue, white, steel grey.</w:t>
-        <w:br/>
-      </w:r>
-      <w:r>
-        <w:rPr>
-          <w:rFonts w:ascii="Consolas" w:hAnsi="Consolas"/>
-          <w:color w:val="202050"/>
-          <w:sz w:val="19"/>
-        </w:rPr>
-        <w:t>6. A chained human silhouette joined by a thin glowing thread to a small mechanical head - muted grey, dull red thread.</w:t>
-      </w:r>
-    </w:p>
-    <w:p>
-      <w:pPr>
-        <w:pStyle w:val="Heading2"/>
-      </w:pPr>
-      <w:r>
-        <w:t>3.2. Мастер ловушек (лист 3×3)</w:t>
+        <w:t>3.1. Эмблемы путей и активки без ловушек (лист 3×3)</w:t>
       </w:r>
     </w:p>
     <w:p>
@@ -236,7 +143,7 @@
           <w:color w:val="202050"/>
           <w:sz w:val="19"/>
         </w:rPr>
-        <w:t>1. Emblem of the path: a round rune disc set in the ground with a small spiked trigger in its centre - dark stone, violet glow.</w:t>
+        <w:t>1. Archconstruct: a heavy cog wheel with a small glowing pale-blue crystal orb at its hub - steel grey, worn bronze, pale blue.</w:t>
         <w:br/>
       </w:r>
       <w:r>
@@ -245,7 +152,7 @@
           <w:color w:val="202050"/>
           <w:sz w:val="19"/>
         </w:rPr>
-        <w:t>2. A rune disc pulling small arrows inward to its centre like a whirlpool - violet, dark grey.</w:t>
+        <w:t>2. Master of Snares: a round rune disc set in the ground with a small spiked trigger in its centre - dark stone, violet glow.</w:t>
         <w:br/>
       </w:r>
       <w:r>
@@ -254,7 +161,7 @@
           <w:color w:val="202050"/>
           <w:sz w:val="19"/>
         </w:rPr>
-        <w:t>3. A rune disc with a jagged bolt rising from it - pale blue, white.</w:t>
+        <w:t>3. Lord of Subspace: a small swirling starry rift held between two cupped hands - deep violet, starry blue, pale skin.</w:t>
         <w:br/>
       </w:r>
       <w:r>
@@ -272,7 +179,7 @@
           <w:color w:val="202050"/>
           <w:sz w:val="19"/>
         </w:rPr>
-        <w:t>4. A rune disc bursting into golden flame - gold, orange, dark grey.</w:t>
+        <w:t>4. Compulsive Creator: a hammer and a chisel crossed over a glowing anvil - steel grey, worn brown, amber glow.</w:t>
         <w:br/>
       </w:r>
       <w:r>
@@ -281,7 +188,7 @@
           <w:color w:val="202050"/>
           <w:sz w:val="19"/>
         </w:rPr>
-        <w:t>5. A rune disc bursting into sharp ice shards - icy blue, white.</w:t>
+        <w:t>5. Energy Architect: a glowing purple stream curling around a small crystal orb like a river of light - purple, pale violet.</w:t>
         <w:br/>
       </w:r>
       <w:r>
@@ -290,7 +197,7 @@
           <w:color w:val="202050"/>
           <w:sz w:val="19"/>
         </w:rPr>
-        <w:t>6. A rune disc bursting in a plain round blast of smoke and debris - grey, dull orange.</w:t>
+        <w:t>6. Soulmark: a chained human silhouette joined by a thin glowing thread to a small mechanical head - muted grey, dull red thread.</w:t>
         <w:br/>
       </w:r>
       <w:r>
@@ -308,7 +215,7 @@
           <w:color w:val="202050"/>
           <w:sz w:val="19"/>
         </w:rPr>
-        <w:t>7. A rune disc bursting into a blinding white star with sound rings around it - white, pale yellow.</w:t>
+        <w:t>7. Veil: a round shimmering veil with small bullets stopping against it and sinking in - violet, pale blue, grey.</w:t>
         <w:br/>
       </w:r>
       <w:r>
@@ -317,7 +224,7 @@
           <w:color w:val="202050"/>
           <w:sz w:val="19"/>
         </w:rPr>
-        <w:t>8. A generic elemental snare: a rune disc with three small flames of gold, ice blue and grey rising from it.</w:t>
+        <w:t>8. Veil discharge: the veil bursting outward in a violet shockwave ring - violet, white.</w:t>
         <w:br/>
       </w:r>
       <w:r>
@@ -326,7 +233,7 @@
           <w:color w:val="202050"/>
           <w:sz w:val="19"/>
         </w:rPr>
-        <w:t>9. Three rune discs linked by a chain of light, one after another - violet, pale blue.</w:t>
+        <w:t>9. Obsession: three small workbenches side by side with sparks rising from each at once - brown, amber.</w:t>
       </w:r>
     </w:p>
     <w:p>
@@ -334,7 +241,7 @@
         <w:pStyle w:val="Heading2"/>
       </w:pPr>
       <w:r>
-        <w:t>3.3. Хозяин подпространства (лист 3×2)</w:t>
+        <w:t>3.2. Ловушки, купол и пламя (лист 5×2)</w:t>
       </w:r>
     </w:p>
     <w:p>
@@ -347,7 +254,7 @@
           <w:color w:val="202050"/>
           <w:sz w:val="19"/>
         </w:rPr>
-        <w:t>A sprite sheet of six separate game ability icons, in a grid of 3 columns and 2 rows, each icon alone in its own equal square cell with clear empty space between cells, on a plain flat medium grey background. STYLE: exactly like RimWorld Ideology ability icons - solid filled heavy shapes with real mass, soft cel shading in three tones, muted slightly dusty colours, no gloss, one very thick black outline around the outer silhouette only, almost no inner lines, compact chunky proportions, each symbol fills about 85 percent of its cell, no texture, no fine detail, readable at 32 pixels. No text, no labels, no grid lines.</w:t>
+        <w:t>A sprite sheet of ten separate game ability icons, in a grid of 5 columns and 2 rows, each icon alone in its own equal square cell with clear empty space between cells, on a plain flat medium grey background. STYLE: exactly like RimWorld Ideology ability icons - solid filled heavy shapes with real mass, soft cel shading in three tones, muted slightly dusty colours, no gloss, one very thick black outline around the outer silhouette only, almost no inner lines, compact chunky proportions, each symbol fills about 85 percent of its cell, no texture, no fine detail, readable at 32 pixels. No text, no labels, no grid lines.</w:t>
         <w:br/>
       </w:r>
       <w:r>
@@ -365,7 +272,7 @@
           <w:color w:val="202050"/>
           <w:sz w:val="19"/>
         </w:rPr>
-        <w:t>1. Emblem of the path: a small swirling starry rift held between two cupped hands - deep violet, starry blue, pale skin.</w:t>
+        <w:t>1. A rune disc pulling small arrows inward to its centre like a whirlpool - violet, dark grey.</w:t>
         <w:br/>
       </w:r>
       <w:r>
@@ -374,7 +281,7 @@
           <w:color w:val="202050"/>
           <w:sz w:val="19"/>
         </w:rPr>
-        <w:t>2. A hand reaching out of a starry rift and grasping a brick and a plank - violet, warm brown.</w:t>
+        <w:t>2. A rune disc with a jagged bolt rising from it - pale blue, white.</w:t>
         <w:br/>
       </w:r>
       <w:r>
@@ -383,7 +290,25 @@
           <w:color w:val="202050"/>
           <w:sz w:val="19"/>
         </w:rPr>
-        <w:t>3. A round shimmering veil with small bullets stopping against it and sinking in - violet, pale blue, grey.</w:t>
+        <w:t>3. A rune disc bursting into golden flame - gold, orange, dark grey.</w:t>
+        <w:br/>
+      </w:r>
+      <w:r>
+        <w:rPr>
+          <w:rFonts w:ascii="Consolas" w:hAnsi="Consolas"/>
+          <w:color w:val="202050"/>
+          <w:sz w:val="19"/>
+        </w:rPr>
+        <w:t>4. A rune disc bursting into sharp ice shards - icy blue, white.</w:t>
+        <w:br/>
+      </w:r>
+      <w:r>
+        <w:rPr>
+          <w:rFonts w:ascii="Consolas" w:hAnsi="Consolas"/>
+          <w:color w:val="202050"/>
+          <w:sz w:val="19"/>
+        </w:rPr>
+        <w:t>5. A rune disc bursting in a plain round blast of smoke and debris - grey, dull orange.</w:t>
         <w:br/>
       </w:r>
       <w:r>
@@ -401,7 +326,7 @@
           <w:color w:val="202050"/>
           <w:sz w:val="19"/>
         </w:rPr>
-        <w:t>4. A leather satchel with a starry swirling rift inside its open flap - brown, violet.</w:t>
+        <w:t>6. A rune disc bursting into a blinding white star with sound rings around it - white, pale yellow.</w:t>
         <w:br/>
       </w:r>
       <w:r>
@@ -410,7 +335,7 @@
           <w:color w:val="202050"/>
           <w:sz w:val="19"/>
         </w:rPr>
-        <w:t>5. The round veil unfolding wider in several rings - violet, pale blue.</w:t>
+        <w:t>7. A wide shimmering dome over a small patch of ground - warm gold, pale yellow.</w:t>
         <w:br/>
       </w:r>
       <w:r>
@@ -419,28 +344,7 @@
           <w:color w:val="202050"/>
           <w:sz w:val="19"/>
         </w:rPr>
-        <w:t>6. The veil bursting outward in a violet shockwave ring - violet, white.</w:t>
-      </w:r>
-    </w:p>
-    <w:p>
-      <w:pPr>
-        <w:pStyle w:val="Heading2"/>
-      </w:pPr>
-      <w:r>
-        <w:t>3.4. Компульсивный Творец (ряд 5×1)</w:t>
-      </w:r>
-    </w:p>
-    <w:p>
-      <w:pPr>
-        <w:ind w:left="240"/>
-      </w:pPr>
-      <w:r>
-        <w:rPr>
-          <w:rFonts w:ascii="Consolas" w:hAnsi="Consolas"/>
-          <w:color w:val="202050"/>
-          <w:sz w:val="19"/>
-        </w:rPr>
-        <w:t>A sprite sheet of five separate game ability icons in one row, each icon alone in its own equal square cell with clear empty space between cells, on a plain flat medium grey background. STYLE: exactly like RimWorld Ideology ability icons - solid filled heavy shapes with real mass, soft cel shading in three tones, muted slightly dusty colours, no gloss, one very thick black outline around the outer silhouette only, almost no inner lines, compact chunky proportions, each symbol fills about 85 percent of its cell, no texture, no fine detail, readable at 32 pixels. No text, no labels, no grid lines.</w:t>
+        <w:t>8. A falling column of golden fire striking the ground - gold, warm yellow.</w:t>
         <w:br/>
       </w:r>
       <w:r>
@@ -449,7 +353,7 @@
           <w:color w:val="202050"/>
           <w:sz w:val="19"/>
         </w:rPr>
-        <w:t>Left to right:</w:t>
+        <w:t>9. A falling column of silver-white moonfire striking the ground - silver, pale blue.</w:t>
         <w:br/>
       </w:r>
       <w:r>
@@ -458,172 +362,7 @@
           <w:color w:val="202050"/>
           <w:sz w:val="19"/>
         </w:rPr>
-        <w:t>1. Emblem of the path: a hammer and a chisel crossed over a glowing workbench anvil - steel grey, worn brown, amber glow.</w:t>
-        <w:br/>
-      </w:r>
-      <w:r>
-        <w:rPr>
-          <w:rFonts w:ascii="Consolas" w:hAnsi="Consolas"/>
-          <w:color w:val="202050"/>
-          <w:sz w:val="19"/>
-        </w:rPr>
-        <w:t>2. Three small workbenches side by side with sparks rising from each at once - brown, amber.</w:t>
-        <w:br/>
-      </w:r>
-      <w:r>
-        <w:rPr>
-          <w:rFonts w:ascii="Consolas" w:hAnsi="Consolas"/>
-          <w:color w:val="202050"/>
-          <w:sz w:val="19"/>
-        </w:rPr>
-        <w:t>3. A pile of coins and ingots with a curved arrow returning part of it - dull gold, steel grey.</w:t>
-        <w:br/>
-      </w:r>
-      <w:r>
-        <w:rPr>
-          <w:rFonts w:ascii="Consolas" w:hAnsi="Consolas"/>
-          <w:color w:val="202050"/>
-          <w:sz w:val="19"/>
-        </w:rPr>
-        <w:t>4. A faceted gem with a small star rising above it - violet gem, gold star.</w:t>
-        <w:br/>
-      </w:r>
-      <w:r>
-        <w:rPr>
-          <w:rFonts w:ascii="Consolas" w:hAnsi="Consolas"/>
-          <w:color w:val="202050"/>
-          <w:sz w:val="19"/>
-        </w:rPr>
-        <w:t>5. Two identical small vases side by side, the second one slightly translucent like an echo - terracotta, pale blue glow.</w:t>
-      </w:r>
-    </w:p>
-    <w:p>
-      <w:pPr>
-        <w:pStyle w:val="Heading2"/>
-      </w:pPr>
-      <w:r>
-        <w:t>3.5. Энергетический архитект (лист 3×3)</w:t>
-      </w:r>
-    </w:p>
-    <w:p>
-      <w:pPr>
-        <w:ind w:left="240"/>
-      </w:pPr>
-      <w:r>
-        <w:rPr>
-          <w:rFonts w:ascii="Consolas" w:hAnsi="Consolas"/>
-          <w:color w:val="202050"/>
-          <w:sz w:val="19"/>
-        </w:rPr>
-        <w:t>A sprite sheet of nine separate game ability icons, in a grid of 3 columns and 3 rows, each icon alone in its own equal square cell with clear empty space between cells, on a plain flat medium grey background. STYLE: exactly like RimWorld Ideology ability icons - solid filled heavy shapes with real mass, soft cel shading in three tones, muted slightly dusty colours, no gloss, one very thick black outline around the outer silhouette only, almost no inner lines, compact chunky proportions, each symbol fills about 85 percent of its cell, no texture, no fine detail, readable at 32 pixels. No text, no labels, no grid lines.</w:t>
-        <w:br/>
-      </w:r>
-      <w:r>
-        <w:rPr>
-          <w:rFonts w:ascii="Consolas" w:hAnsi="Consolas"/>
-          <w:color w:val="202050"/>
-          <w:sz w:val="19"/>
-        </w:rPr>
-        <w:t>Top row, left to right:</w:t>
-        <w:br/>
-      </w:r>
-      <w:r>
-        <w:rPr>
-          <w:rFonts w:ascii="Consolas" w:hAnsi="Consolas"/>
-          <w:color w:val="202050"/>
-          <w:sz w:val="19"/>
-        </w:rPr>
-        <w:t>1. Emblem of the path: a glowing purple stream curling around a small crystal orb like a river of light - purple, pale violet.</w:t>
-        <w:br/>
-      </w:r>
-      <w:r>
-        <w:rPr>
-          <w:rFonts w:ascii="Consolas" w:hAnsi="Consolas"/>
-          <w:color w:val="202050"/>
-          <w:sz w:val="19"/>
-        </w:rPr>
-        <w:t>2. A pilot's winged helm with a purple stream flowing into it - silver, purple.</w:t>
-        <w:br/>
-      </w:r>
-      <w:r>
-        <w:rPr>
-          <w:rFonts w:ascii="Consolas" w:hAnsi="Consolas"/>
-          <w:color w:val="202050"/>
-          <w:sz w:val="19"/>
-        </w:rPr>
-        <w:t>3. A wide shimmering dome over a small patch of ground - warm gold, pale yellow.</w:t>
-        <w:br/>
-      </w:r>
-      <w:r>
-        <w:rPr>
-          <w:rFonts w:ascii="Consolas" w:hAnsi="Consolas"/>
-          <w:color w:val="202050"/>
-          <w:sz w:val="19"/>
-        </w:rPr>
-        <w:t>Middle row, left to right:</w:t>
-        <w:br/>
-      </w:r>
-      <w:r>
-        <w:rPr>
-          <w:rFonts w:ascii="Consolas" w:hAnsi="Consolas"/>
-          <w:color w:val="202050"/>
-          <w:sz w:val="19"/>
-        </w:rPr>
-        <w:t>4. A falling column of fire striking the ground, neutral and generic - orange, dark grey.</w:t>
-        <w:br/>
-      </w:r>
-      <w:r>
-        <w:rPr>
-          <w:rFonts w:ascii="Consolas" w:hAnsi="Consolas"/>
-          <w:color w:val="202050"/>
-          <w:sz w:val="19"/>
-        </w:rPr>
-        <w:t>5. Thin silver lines running through stone in a neat pattern, glowing - silver, dark stone.</w:t>
-        <w:br/>
-      </w:r>
-      <w:r>
-        <w:rPr>
-          <w:rFonts w:ascii="Consolas" w:hAnsi="Consolas"/>
-          <w:color w:val="202050"/>
-          <w:sz w:val="19"/>
-        </w:rPr>
-        <w:t>6. A large glowing crystal sphere cradled in silver arms with a small winged helm above it - violet crystal, silver.</w:t>
-        <w:br/>
-      </w:r>
-      <w:r>
-        <w:rPr>
-          <w:rFonts w:ascii="Consolas" w:hAnsi="Consolas"/>
-          <w:color w:val="202050"/>
-          <w:sz w:val="19"/>
-        </w:rPr>
-        <w:t>Bottom row, left to right:</w:t>
-        <w:br/>
-      </w:r>
-      <w:r>
-        <w:rPr>
-          <w:rFonts w:ascii="Consolas" w:hAnsi="Consolas"/>
-          <w:color w:val="202050"/>
-          <w:sz w:val="19"/>
-        </w:rPr>
-        <w:t>7. The same falling column of fire but golden - gold, warm yellow.</w:t>
-        <w:br/>
-      </w:r>
-      <w:r>
-        <w:rPr>
-          <w:rFonts w:ascii="Consolas" w:hAnsi="Consolas"/>
-          <w:color w:val="202050"/>
-          <w:sz w:val="19"/>
-        </w:rPr>
-        <w:t>8. The same falling column of fire but silver-white, like moonfire - silver, pale blue.</w:t>
-        <w:br/>
-      </w:r>
-      <w:r>
-        <w:rPr>
-          <w:rFonts w:ascii="Consolas" w:hAnsi="Consolas"/>
-          <w:color w:val="202050"/>
-          <w:sz w:val="19"/>
-        </w:rPr>
-        <w:t>9. A plain round blast with debris, no fire - grey, dull orange.</w:t>
+        <w:t>10. A plain round blast with debris, no fire - grey, dull orange.</w:t>
       </w:r>
     </w:p>
     <w:p>
@@ -995,7 +734,7 @@
         <w:pStyle w:val="ListBullet"/>
       </w:pPr>
       <w:r>
-        <w:t xml:space="preserve">Архконструкт → </w:t>
+        <w:t xml:space="preserve">Архитекты, лист 3.1 → </w:t>
       </w:r>
       <w:r>
         <w:rPr>
@@ -1022,7 +761,37 @@
           <w:rFonts w:ascii="Consolas" w:hAnsi="Consolas"/>
           <w:sz w:val="20"/>
         </w:rPr>
-        <w:t>Archconstruct_1..4</w:t>
+        <w:t>Path_Snares</w:t>
+      </w:r>
+      <w:r>
+        <w:t xml:space="preserve">, </w:t>
+      </w:r>
+      <w:r>
+        <w:rPr>
+          <w:rFonts w:ascii="Consolas" w:hAnsi="Consolas"/>
+          <w:sz w:val="20"/>
+        </w:rPr>
+        <w:t>Path_Subspace</w:t>
+      </w:r>
+      <w:r>
+        <w:t xml:space="preserve">, </w:t>
+      </w:r>
+      <w:r>
+        <w:rPr>
+          <w:rFonts w:ascii="Consolas" w:hAnsi="Consolas"/>
+          <w:sz w:val="20"/>
+        </w:rPr>
+        <w:t>Path_Creator</w:t>
+      </w:r>
+      <w:r>
+        <w:t xml:space="preserve">, </w:t>
+      </w:r>
+      <w:r>
+        <w:rPr>
+          <w:rFonts w:ascii="Consolas" w:hAnsi="Consolas"/>
+          <w:sz w:val="20"/>
+        </w:rPr>
+        <w:t>Path_Energy</w:t>
       </w:r>
       <w:r>
         <w:t xml:space="preserve">, </w:t>
@@ -1035,6 +804,36 @@
         <w:t>Soulmark</w:t>
       </w:r>
       <w:r>
+        <w:t xml:space="preserve">, </w:t>
+      </w:r>
+      <w:r>
+        <w:rPr>
+          <w:rFonts w:ascii="Consolas" w:hAnsi="Consolas"/>
+          <w:sz w:val="20"/>
+        </w:rPr>
+        <w:t>Veil</w:t>
+      </w:r>
+      <w:r>
+        <w:t xml:space="preserve">, </w:t>
+      </w:r>
+      <w:r>
+        <w:rPr>
+          <w:rFonts w:ascii="Consolas" w:hAnsi="Consolas"/>
+          <w:sz w:val="20"/>
+        </w:rPr>
+        <w:t>Veil_Discharge</w:t>
+      </w:r>
+      <w:r>
+        <w:t xml:space="preserve">, </w:t>
+      </w:r>
+      <w:r>
+        <w:rPr>
+          <w:rFonts w:ascii="Consolas" w:hAnsi="Consolas"/>
+          <w:sz w:val="20"/>
+        </w:rPr>
+        <w:t>Obsession</w:t>
+      </w:r>
+      <w:r>
         <w:t>.</w:t>
       </w:r>
     </w:p>
@@ -1043,7 +842,7 @@
         <w:pStyle w:val="ListBullet"/>
       </w:pPr>
       <w:r>
-        <w:t xml:space="preserve">Ловушки → </w:t>
+        <w:t xml:space="preserve">Архитекты, лист 3.2 → </w:t>
       </w:r>
       <w:r>
         <w:rPr>
@@ -1053,28 +852,8 @@
         <w:t>UI/Avir/Spheres/</w:t>
       </w:r>
       <w:r>
-        <w:t>:</w:t>
+        <w:t xml:space="preserve">: </w:t>
       </w:r>
-    </w:p>
-    <w:p>
-      <w:pPr>
-        <w:pStyle w:val="ListBullet2"/>
-      </w:pPr>
-      <w:r>
-        <w:rPr>
-          <w:rFonts w:ascii="Consolas" w:hAnsi="Consolas"/>
-          <w:sz w:val="20"/>
-        </w:rPr>
-        <w:t>Path_Snares</w:t>
-      </w:r>
-      <w:r>
-        <w:t>;</w:t>
-      </w:r>
-    </w:p>
-    <w:p>
-      <w:pPr>
-        <w:pStyle w:val="ListBullet2"/>
-      </w:pPr>
       <w:r>
         <w:rPr>
           <w:rFonts w:ascii="Consolas" w:hAnsi="Consolas"/>
@@ -1083,17 +862,7 @@
         <w:t>Snare_Binding</w:t>
       </w:r>
       <w:r>
-        <w:t xml:space="preserve"> (он же </w:t>
-      </w:r>
-      <w:r>
-        <w:rPr>
-          <w:rFonts w:ascii="Consolas" w:hAnsi="Consolas"/>
-          <w:sz w:val="20"/>
-        </w:rPr>
-        <w:t>Snares_1</w:t>
-      </w:r>
-      <w:r>
-        <w:t xml:space="preserve">), </w:t>
+        <w:t xml:space="preserve">, </w:t>
       </w:r>
       <w:r>
         <w:rPr>
@@ -1133,46 +902,6 @@
         <w:t>Snare_Blast</w:t>
       </w:r>
       <w:r>
-        <w:t>;</w:t>
-      </w:r>
-    </w:p>
-    <w:p>
-      <w:pPr>
-        <w:pStyle w:val="ListBullet2"/>
-      </w:pPr>
-      <w:r>
-        <w:rPr>
-          <w:rFonts w:ascii="Consolas" w:hAnsi="Consolas"/>
-          <w:sz w:val="20"/>
-        </w:rPr>
-        <w:t>Snare_Flash</w:t>
-      </w:r>
-      <w:r>
-        <w:t xml:space="preserve"> (он же </w:t>
-      </w:r>
-      <w:r>
-        <w:rPr>
-          <w:rFonts w:ascii="Consolas" w:hAnsi="Consolas"/>
-          <w:sz w:val="20"/>
-        </w:rPr>
-        <w:t>Snares_3</w:t>
-      </w:r>
-      <w:r>
-        <w:t>);</w:t>
-      </w:r>
-    </w:p>
-    <w:p>
-      <w:pPr>
-        <w:pStyle w:val="ListBullet2"/>
-      </w:pPr>
-      <w:r>
-        <w:rPr>
-          <w:rFonts w:ascii="Consolas" w:hAnsi="Consolas"/>
-          <w:sz w:val="20"/>
-        </w:rPr>
-        <w:t>Snares_2</w:t>
-      </w:r>
-      <w:r>
         <w:t xml:space="preserve">, </w:t>
       </w:r>
       <w:r>
@@ -1180,131 +909,7 @@
           <w:rFonts w:ascii="Consolas" w:hAnsi="Consolas"/>
           <w:sz w:val="20"/>
         </w:rPr>
-        <w:t>Snares_4</w:t>
-      </w:r>
-      <w:r>
-        <w:t>.</w:t>
-      </w:r>
-    </w:p>
-    <w:p>
-      <w:pPr>
-        <w:pStyle w:val="ListBullet"/>
-      </w:pPr>
-      <w:r>
-        <w:t xml:space="preserve">Подпространство → </w:t>
-      </w:r>
-      <w:r>
-        <w:rPr>
-          <w:rFonts w:ascii="Consolas" w:hAnsi="Consolas"/>
-          <w:sz w:val="20"/>
-        </w:rPr>
-        <w:t>UI/Avir/Spheres/</w:t>
-      </w:r>
-      <w:r>
-        <w:t xml:space="preserve">: </w:t>
-      </w:r>
-      <w:r>
-        <w:rPr>
-          <w:rFonts w:ascii="Consolas" w:hAnsi="Consolas"/>
-          <w:sz w:val="20"/>
-        </w:rPr>
-        <w:t>Path_Subspace</w:t>
-      </w:r>
-      <w:r>
-        <w:t xml:space="preserve">, </w:t>
-      </w:r>
-      <w:r>
-        <w:rPr>
-          <w:rFonts w:ascii="Consolas" w:hAnsi="Consolas"/>
-          <w:sz w:val="20"/>
-        </w:rPr>
-        <w:t>Subspace_1..4</w:t>
-      </w:r>
-      <w:r>
-        <w:t xml:space="preserve">, </w:t>
-      </w:r>
-      <w:r>
-        <w:rPr>
-          <w:rFonts w:ascii="Consolas" w:hAnsi="Consolas"/>
-          <w:sz w:val="20"/>
-        </w:rPr>
-        <w:t>Veil_Discharge</w:t>
-      </w:r>
-      <w:r>
-        <w:t>.</w:t>
-      </w:r>
-    </w:p>
-    <w:p>
-      <w:pPr>
-        <w:pStyle w:val="ListBullet"/>
-      </w:pPr>
-      <w:r>
-        <w:t xml:space="preserve">Творец → </w:t>
-      </w:r>
-      <w:r>
-        <w:rPr>
-          <w:rFonts w:ascii="Consolas" w:hAnsi="Consolas"/>
-          <w:sz w:val="20"/>
-        </w:rPr>
-        <w:t>UI/Avir/Spheres/</w:t>
-      </w:r>
-      <w:r>
-        <w:t xml:space="preserve">: </w:t>
-      </w:r>
-      <w:r>
-        <w:rPr>
-          <w:rFonts w:ascii="Consolas" w:hAnsi="Consolas"/>
-          <w:sz w:val="20"/>
-        </w:rPr>
-        <w:t>Path_Creator</w:t>
-      </w:r>
-      <w:r>
-        <w:t xml:space="preserve">, </w:t>
-      </w:r>
-      <w:r>
-        <w:rPr>
-          <w:rFonts w:ascii="Consolas" w:hAnsi="Consolas"/>
-          <w:sz w:val="20"/>
-        </w:rPr>
-        <w:t>Creator_1..4</w:t>
-      </w:r>
-      <w:r>
-        <w:t>.</w:t>
-      </w:r>
-    </w:p>
-    <w:p>
-      <w:pPr>
-        <w:pStyle w:val="ListBullet"/>
-      </w:pPr>
-      <w:r>
-        <w:t xml:space="preserve">Энергия → </w:t>
-      </w:r>
-      <w:r>
-        <w:rPr>
-          <w:rFonts w:ascii="Consolas" w:hAnsi="Consolas"/>
-          <w:sz w:val="20"/>
-        </w:rPr>
-        <w:t>UI/Avir/Spheres/</w:t>
-      </w:r>
-      <w:r>
-        <w:t xml:space="preserve">, по ячейкам: </w:t>
-      </w:r>
-      <w:r>
-        <w:rPr>
-          <w:rFonts w:ascii="Consolas" w:hAnsi="Consolas"/>
-          <w:sz w:val="20"/>
-        </w:rPr>
-        <w:t>Path_Energy</w:t>
-      </w:r>
-      <w:r>
-        <w:t xml:space="preserve">, </w:t>
-      </w:r>
-      <w:r>
-        <w:rPr>
-          <w:rFonts w:ascii="Consolas" w:hAnsi="Consolas"/>
-          <w:sz w:val="20"/>
-        </w:rPr>
-        <w:t>Energy_1</w:t>
+        <w:t>Snare_Flash</w:t>
       </w:r>
       <w:r>
         <w:t xml:space="preserve">, </w:t>
@@ -1315,36 +920,6 @@
           <w:sz w:val="20"/>
         </w:rPr>
         <w:t>Energy_Dome</w:t>
-      </w:r>
-      <w:r>
-        <w:t xml:space="preserve">, </w:t>
-      </w:r>
-      <w:r>
-        <w:rPr>
-          <w:rFonts w:ascii="Consolas" w:hAnsi="Consolas"/>
-          <w:sz w:val="20"/>
-        </w:rPr>
-        <w:t>Energy_2</w:t>
-      </w:r>
-      <w:r>
-        <w:t xml:space="preserve">, </w:t>
-      </w:r>
-      <w:r>
-        <w:rPr>
-          <w:rFonts w:ascii="Consolas" w:hAnsi="Consolas"/>
-          <w:sz w:val="20"/>
-        </w:rPr>
-        <w:t>Energy_3</w:t>
-      </w:r>
-      <w:r>
-        <w:t xml:space="preserve">, </w:t>
-      </w:r>
-      <w:r>
-        <w:rPr>
-          <w:rFonts w:ascii="Consolas" w:hAnsi="Consolas"/>
-          <w:sz w:val="20"/>
-        </w:rPr>
-        <w:t>Energy_4</w:t>
       </w:r>
       <w:r>
         <w:t xml:space="preserve">, </w:t>

</xml_diff>

<commit_message>
FIXES-ZK: spheres texture and rune glyphs from art; icon prompts in the mod's parchment style
Co-Authored-By: Claude Opus 5.5 <noreply@anthropic.com>
Claude-Session: https://claude.ai/code/session_01YCWNLtj9zFsogxZeNiDKcG
</commit_message>
<xml_diff>
--- a/Арт-промпты.docx
+++ b/Арт-промпты.docx
@@ -7,17 +7,80 @@
         <w:pStyle w:val="Title"/>
       </w:pPr>
       <w:r>
-        <w:t>Арт для FIXES-ZK — все промпты одним текстом</w:t>
+        <w:t>Арт для FIXES-ZK — промпты (вторая версия)</w:t>
       </w:r>
     </w:p>
     <w:p>
       <w:r>
-        <w:t>Пришли мне получившиеся картинки (листы целиком). Я сам разрежу их, уберу фон и разложу по папкам. Пока картинок нет, в игре стоят временные замены: руны, вещь сфер, мои заготовки эффектов.</w:t>
+        <w:t>Уже готово и разложено:</w:t>
+      </w:r>
+    </w:p>
+    <w:p>
+      <w:pPr>
+        <w:pStyle w:val="ListBullet"/>
+      </w:pPr>
+      <w:r>
+        <w:t>сферы управления;</w:t>
+      </w:r>
+    </w:p>
+    <w:p>
+      <w:pPr>
+        <w:pStyle w:val="ListBullet"/>
+      </w:pPr>
+      <w:r>
+        <w:t>глифы рун Крови и Покрова.</w:t>
       </w:r>
     </w:p>
     <w:p>
       <w:r>
-        <w:t>Всего 6 генераций: 1 вещь, 1 лист глифов, 2 листа иконок архитектов, 1 лист Страйдеров, 1 лист эффектов. Во всех листах ячейки одинаковые и квадратные, между ними пустое место.</w:t>
+        <w:t xml:space="preserve">Иконки переделываем </w:t>
+      </w:r>
+      <w:r>
+        <w:rPr>
+          <w:b/>
+        </w:rPr>
+        <w:t>в старом стиле мода</w:t>
+      </w:r>
+      <w:r>
+        <w:t>: пергамент, чернила, золото, рамки. Это как Anchor, Rend, Wide reach и другие. Порядок рамок тот же, что раньше:</w:t>
+      </w:r>
+    </w:p>
+    <w:p>
+      <w:pPr>
+        <w:pStyle w:val="ListBullet"/>
+      </w:pPr>
+      <w:r>
+        <w:rPr>
+          <w:b/>
+        </w:rPr>
+        <w:t>круглая рамка</w:t>
+      </w:r>
+      <w:r>
+        <w:t xml:space="preserve"> — активные способности (кнопки);</w:t>
+      </w:r>
+    </w:p>
+    <w:p>
+      <w:pPr>
+        <w:pStyle w:val="ListBullet"/>
+      </w:pPr>
+      <w:r>
+        <w:rPr>
+          <w:b/>
+        </w:rPr>
+        <w:t>ромбовидная рамка</w:t>
+      </w:r>
+      <w:r>
+        <w:t xml:space="preserve"> — пути (эмблемы для выбора).</w:t>
+      </w:r>
+    </w:p>
+    <w:p>
+      <w:r>
+        <w:t>Пути рисуются символами, а не сценками того, что делает способность.</w:t>
+      </w:r>
+    </w:p>
+    <w:p>
+      <w:r>
+        <w:t>Осталось 4 генерации: 2 листа иконок архитектов, 1 лист Страйдеров, 1 лист эффектов.</w:t>
       </w:r>
     </w:p>
     <w:p>
@@ -25,7 +88,7 @@
         <w:pStyle w:val="Heading1"/>
       </w:pPr>
       <w:r>
-        <w:t>1. Предмет — сферы управления архитекта (256×256)</w:t>
+        <w:t>1. Архитекты: эмблемы путей и активки (лист 3×3)</w:t>
       </w:r>
     </w:p>
     <w:p>
@@ -38,7 +101,133 @@
           <w:color w:val="202050"/>
           <w:sz w:val="19"/>
         </w:rPr>
-        <w:t>Three small floating orbs of pale blue luminous crystal, each held in a thin band of dark crimson metal, linked by faint threads of light, arranged in a triangle. Game item icon, top-down three-quarter view, centered, clean dark outline, soft inner glow, painterly fantasy style, transparent background, 256x256</w:t>
+        <w:t>A single sprite sheet of 9 game icons arranged in a 3x3 grid, each icon in its own equal square cell with generous empty space between cells, plain transparent background, no text, no letters, no numbers, no labels.</w:t>
+        <w:br/>
+      </w:r>
+      <w:r>
+        <w:rPr>
+          <w:rFonts w:ascii="Consolas" w:hAnsi="Consolas"/>
+          <w:color w:val="202050"/>
+          <w:sz w:val="19"/>
+        </w:rPr>
+        <w:t>Unified style for all 9: hand-inked on aged parchment, dark iron-gall ink linework with gold leaf accents, engraved medieval-alchemical look, Avir telekinetic-psychic magic, one bold central symbol per icon, strong silhouette readable at 32 px, flat front view, same line weight, same palette (sepia ink, gold, a little deep red) and same lighting across the whole sheet.</w:t>
+        <w:br/>
+      </w:r>
+      <w:r>
+        <w:rPr>
+          <w:rFonts w:ascii="Consolas" w:hAnsi="Consolas"/>
+          <w:color w:val="202050"/>
+          <w:sz w:val="19"/>
+        </w:rPr>
+        <w:t>Icons 1 to 5 are the emblems of the five paths of an architect, each inside a diamond-shaped frame. Icons 6 to 9 are active abilities, each inside a thin circular rune frame.</w:t>
+        <w:br/>
+      </w:r>
+      <w:r>
+        <w:rPr>
+          <w:rFonts w:ascii="Consolas" w:hAnsi="Consolas"/>
+          <w:color w:val="202050"/>
+          <w:sz w:val="19"/>
+        </w:rPr>
+        <w:t>Top row:</w:t>
+        <w:br/>
+      </w:r>
+      <w:r>
+        <w:rPr>
+          <w:rFonts w:ascii="Consolas" w:hAnsi="Consolas"/>
+          <w:color w:val="202050"/>
+          <w:sz w:val="19"/>
+        </w:rPr>
+        <w:t>1. Archconstruct - a gear wheel with a small glowing crystal orb at its hub, three tiny floating spheres circling it.</w:t>
+        <w:br/>
+      </w:r>
+      <w:r>
+        <w:rPr>
+          <w:rFonts w:ascii="Consolas" w:hAnsi="Consolas"/>
+          <w:color w:val="202050"/>
+          <w:sz w:val="19"/>
+        </w:rPr>
+        <w:t>2. Master of Snares - a rune circle drawn on the ground, a single thread of light stretched across it like a tripwire.</w:t>
+        <w:br/>
+      </w:r>
+      <w:r>
+        <w:rPr>
+          <w:rFonts w:ascii="Consolas" w:hAnsi="Consolas"/>
+          <w:color w:val="202050"/>
+          <w:sz w:val="19"/>
+        </w:rPr>
+        <w:t>3. Lord of Subspace - a small starry rift held between two cupped hands, a satchel strap curling around them.</w:t>
+        <w:br/>
+      </w:r>
+      <w:r>
+        <w:rPr>
+          <w:rFonts w:ascii="Consolas" w:hAnsi="Consolas"/>
+          <w:color w:val="202050"/>
+          <w:sz w:val="19"/>
+        </w:rPr>
+        <w:t>Middle row:</w:t>
+        <w:br/>
+      </w:r>
+      <w:r>
+        <w:rPr>
+          <w:rFonts w:ascii="Consolas" w:hAnsi="Consolas"/>
+          <w:color w:val="202050"/>
+          <w:sz w:val="19"/>
+        </w:rPr>
+        <w:t>4. Compulsive Creator - a hammer and a chisel crossed over an anvil, small sparks rising like a crown.</w:t>
+        <w:br/>
+      </w:r>
+      <w:r>
+        <w:rPr>
+          <w:rFonts w:ascii="Consolas" w:hAnsi="Consolas"/>
+          <w:color w:val="202050"/>
+          <w:sz w:val="19"/>
+        </w:rPr>
+        <w:t>5. Energy Architect - a winding river of light flowing around a crystal sphere held in silver claws.</w:t>
+        <w:br/>
+      </w:r>
+      <w:r>
+        <w:rPr>
+          <w:rFonts w:ascii="Consolas" w:hAnsi="Consolas"/>
+          <w:color w:val="202050"/>
+          <w:sz w:val="19"/>
+        </w:rPr>
+        <w:t>6. Soulmark - a chained hand joined by a thin glowing thread to a small mechanical mask.</w:t>
+        <w:br/>
+      </w:r>
+      <w:r>
+        <w:rPr>
+          <w:rFonts w:ascii="Consolas" w:hAnsi="Consolas"/>
+          <w:color w:val="202050"/>
+          <w:sz w:val="19"/>
+        </w:rPr>
+        <w:t>Bottom row:</w:t>
+        <w:br/>
+      </w:r>
+      <w:r>
+        <w:rPr>
+          <w:rFonts w:ascii="Consolas" w:hAnsi="Consolas"/>
+          <w:color w:val="202050"/>
+          <w:sz w:val="19"/>
+        </w:rPr>
+        <w:t>7. Subspace veil - a round shimmering veil around a small figure, arrows stopping against it and sinking in.</w:t>
+        <w:br/>
+      </w:r>
+      <w:r>
+        <w:rPr>
+          <w:rFonts w:ascii="Consolas" w:hAnsi="Consolas"/>
+          <w:color w:val="202050"/>
+          <w:sz w:val="19"/>
+        </w:rPr>
+        <w:t>8. Veil discharge - the veil bursting outward in rings of light, the swallowed arrows thrown back out.</w:t>
+        <w:br/>
+      </w:r>
+      <w:r>
+        <w:rPr>
+          <w:rFonts w:ascii="Consolas" w:hAnsi="Consolas"/>
+          <w:color w:val="202050"/>
+          <w:sz w:val="19"/>
+        </w:rPr>
+        <w:t>9. Obsession - three small workbenches side by side with a tool floating over each, lifted by telekinetic glow.</w:t>
       </w:r>
     </w:p>
     <w:p>
@@ -46,12 +235,7 @@
         <w:pStyle w:val="Heading1"/>
       </w:pPr>
       <w:r>
-        <w:t>2. Глифы новых рун — Кровь и Покров (лист 2×1)</w:t>
-      </w:r>
-    </w:p>
-    <w:p>
-      <w:r>
-        <w:t>Светящуюся (белую) версию сделаю из чёрной сам.</w:t>
+        <w:t>2. Архитекты: ловушки, купол и пламя (лист 5×2)</w:t>
       </w:r>
     </w:p>
     <w:p>
@@ -64,7 +248,7 @@
           <w:color w:val="202050"/>
           <w:sz w:val="19"/>
         </w:rPr>
-        <w:t>Two separate calligraphic rune glyphs side by side on one sheet, each alone in its own equal square cell with clear empty space between them. Black ink only, sharp thorned brush strokes, elegant and symmetrical, ornamental elvish style, flat black, no shading, no text, no grid lines.</w:t>
+        <w:t>A single sprite sheet of 10 game ability icons arranged in a 5x2 grid, each icon in its own equal square cell with generous empty space between cells, plain transparent background, no text, no letters, no numbers, no labels.</w:t>
         <w:br/>
       </w:r>
       <w:r>
@@ -73,7 +257,7 @@
           <w:color w:val="202050"/>
           <w:sz w:val="19"/>
         </w:rPr>
-        <w:t>Left: a falling drop of blood split down the middle by a thin blade.</w:t>
+        <w:t>Unified style for all 10: hand-inked on aged parchment, dark iron-gall ink linework with gold leaf accents, engraved medieval-alchemical look, Avir telekinetic-psychic magic, one bold central symbol per icon, strong silhouette readable at 32 px, flat front view, same line weight, same palette (sepia ink, gold, a little deep red) and same lighting across the whole sheet. Every icon sits inside the same thin circular rune frame.</w:t>
         <w:br/>
       </w:r>
       <w:r>
@@ -82,7 +266,7 @@
           <w:color w:val="202050"/>
           <w:sz w:val="19"/>
         </w:rPr>
-        <w:t>Right: a hooded veil draped over an empty arch.</w:t>
+        <w:t>Top row:</w:t>
         <w:br/>
       </w:r>
       <w:r>
@@ -91,7 +275,97 @@
           <w:color w:val="202050"/>
           <w:sz w:val="19"/>
         </w:rPr>
-        <w:t>Transparent background.</w:t>
+        <w:t>1. Binding snare - a rune circle with spiral lines pulling small figures inward to its centre.</w:t>
+        <w:br/>
+      </w:r>
+      <w:r>
+        <w:rPr>
+          <w:rFonts w:ascii="Consolas" w:hAnsi="Consolas"/>
+          <w:color w:val="202050"/>
+          <w:sz w:val="19"/>
+        </w:rPr>
+        <w:t>2. Stunning snare - a rune circle with a short jagged bolt rising from its centre.</w:t>
+        <w:br/>
+      </w:r>
+      <w:r>
+        <w:rPr>
+          <w:rFonts w:ascii="Consolas" w:hAnsi="Consolas"/>
+          <w:color w:val="202050"/>
+          <w:sz w:val="19"/>
+        </w:rPr>
+        <w:t>3. Fire snare - a rune circle with a tongue of golden flame rising from its centre.</w:t>
+        <w:br/>
+      </w:r>
+      <w:r>
+        <w:rPr>
+          <w:rFonts w:ascii="Consolas" w:hAnsi="Consolas"/>
+          <w:color w:val="202050"/>
+          <w:sz w:val="19"/>
+        </w:rPr>
+        <w:t>4. Frost snare - a rune circle with sharp ice shards rising from its centre.</w:t>
+        <w:br/>
+      </w:r>
+      <w:r>
+        <w:rPr>
+          <w:rFonts w:ascii="Consolas" w:hAnsi="Consolas"/>
+          <w:color w:val="202050"/>
+          <w:sz w:val="19"/>
+        </w:rPr>
+        <w:t>5. Blast snare - a rune circle bursting in a plain round blast of smoke and stones.</w:t>
+        <w:br/>
+      </w:r>
+      <w:r>
+        <w:rPr>
+          <w:rFonts w:ascii="Consolas" w:hAnsi="Consolas"/>
+          <w:color w:val="202050"/>
+          <w:sz w:val="19"/>
+        </w:rPr>
+        <w:t>Bottom row:</w:t>
+        <w:br/>
+      </w:r>
+      <w:r>
+        <w:rPr>
+          <w:rFonts w:ascii="Consolas" w:hAnsi="Consolas"/>
+          <w:color w:val="202050"/>
+          <w:sz w:val="19"/>
+        </w:rPr>
+        <w:t>6. Flash snare - a rune circle with a blinding eight-pointed star and sound rings around it.</w:t>
+        <w:br/>
+      </w:r>
+      <w:r>
+        <w:rPr>
+          <w:rFonts w:ascii="Consolas" w:hAnsi="Consolas"/>
+          <w:color w:val="202050"/>
+          <w:sz w:val="19"/>
+        </w:rPr>
+        <w:t>7. Energy dome - a half-dome of light standing over a small patch of ground.</w:t>
+        <w:br/>
+      </w:r>
+      <w:r>
+        <w:rPr>
+          <w:rFonts w:ascii="Consolas" w:hAnsi="Consolas"/>
+          <w:color w:val="202050"/>
+          <w:sz w:val="19"/>
+        </w:rPr>
+        <w:t>8. Golden flame - a column of golden fire falling from above onto the ground.</w:t>
+        <w:br/>
+      </w:r>
+      <w:r>
+        <w:rPr>
+          <w:rFonts w:ascii="Consolas" w:hAnsi="Consolas"/>
+          <w:color w:val="202050"/>
+          <w:sz w:val="19"/>
+        </w:rPr>
+        <w:t>9. Silver flame - a column of pale silver moonfire falling from above onto the ground.</w:t>
+        <w:br/>
+      </w:r>
+      <w:r>
+        <w:rPr>
+          <w:rFonts w:ascii="Consolas" w:hAnsi="Consolas"/>
+          <w:color w:val="202050"/>
+          <w:sz w:val="19"/>
+        </w:rPr>
+        <w:t>10. Energy strike - a plain round burst of force with stones thrown outward, no fire.</w:t>
       </w:r>
     </w:p>
     <w:p>
@@ -99,20 +373,12 @@
         <w:pStyle w:val="Heading1"/>
       </w:pPr>
       <w:r>
-        <w:t>3. Иконки архитектов — пути для выбора и активки (2 листа)</w:t>
+        <w:t>3. Страйдеры: пути и выстрелы (лист 5×2)</w:t>
       </w:r>
     </w:p>
     <w:p>
       <w:r>
-        <w:t>Пассивки иконок не получают: на созвездии вместо них камни.</w:t>
-      </w:r>
-    </w:p>
-    <w:p>
-      <w:pPr>
-        <w:pStyle w:val="Heading2"/>
-      </w:pPr>
-      <w:r>
-        <w:t>3.1. Эмблемы путей и активки без ловушек (лист 3×3)</w:t>
+        <w:t>Верхний ряд — эмблемы путей лука (символы, а не стрела с эффектом). Нижний ряд — большие выстрелы на 18 камнях.</w:t>
       </w:r>
     </w:p>
     <w:p>
@@ -125,7 +391,7 @@
           <w:color w:val="202050"/>
           <w:sz w:val="19"/>
         </w:rPr>
-        <w:t>A sprite sheet of nine separate game ability icons, in a grid of 3 columns and 3 rows, each icon alone in its own equal square cell with clear empty space between cells, on a plain flat medium grey background. STYLE: exactly like RimWorld Ideology ability icons - solid filled heavy shapes with real mass, soft cel shading in three tones, muted slightly dusty colours, no gloss, one very thick black outline around the outer silhouette only, almost no inner lines, compact chunky proportions, each symbol fills about 85 percent of its cell, no texture, no fine detail, readable at 32 pixels. No text, no labels, no grid lines.</w:t>
+        <w:t>A single sprite sheet of 10 game icons arranged in a 5x2 grid, each icon in its own equal square cell with generous empty space between cells, plain transparent background, no text, no letters, no numbers, no labels.</w:t>
         <w:br/>
       </w:r>
       <w:r>
@@ -134,7 +400,7 @@
           <w:color w:val="202050"/>
           <w:sz w:val="19"/>
         </w:rPr>
-        <w:t>Top row, left to right:</w:t>
+        <w:t>Unified style for all 10: hand-inked on aged parchment, dark iron-gall ink linework with gold leaf accents, engraved medieval-alchemical look, Avir telekinetic-psychic magic, one bold central symbol per icon, strong silhouette readable at 32 px, flat front view, same line weight, same palette (sepia ink, gold, a little deep red) and same lighting across the whole sheet.</w:t>
         <w:br/>
       </w:r>
       <w:r>
@@ -143,7 +409,7 @@
           <w:color w:val="202050"/>
           <w:sz w:val="19"/>
         </w:rPr>
-        <w:t>1. Archconstruct: a heavy cog wheel with a small glowing pale-blue crystal orb at its hub - steel grey, worn bronze, pale blue.</w:t>
+        <w:t>Every arrow on this sheet is an ordinary arrow: a single arrowhead at the front and feather fletching at the back - never two arrowheads.</w:t>
         <w:br/>
       </w:r>
       <w:r>
@@ -152,7 +418,7 @@
           <w:color w:val="202050"/>
           <w:sz w:val="19"/>
         </w:rPr>
-        <w:t>2. Master of Snares: a round rune disc set in the ground with a small spiked trigger in its centre - dark stone, violet glow.</w:t>
+        <w:t>Top row = the five paths of a longbow, each inside a diamond-shaped frame:</w:t>
         <w:br/>
       </w:r>
       <w:r>
@@ -161,7 +427,7 @@
           <w:color w:val="202050"/>
           <w:sz w:val="19"/>
         </w:rPr>
-        <w:t>3. Lord of Subspace: a small swirling starry rift held between two cupped hands - deep violet, starry blue, pale skin.</w:t>
+        <w:t>1. Hunt - a predator's eye above three claw marks.</w:t>
         <w:br/>
       </w:r>
       <w:r>
@@ -170,7 +436,7 @@
           <w:color w:val="202050"/>
           <w:sz w:val="19"/>
         </w:rPr>
-        <w:t>Middle row, left to right:</w:t>
+        <w:t>2. Storm - a storm cloud crest with a single bolt beneath it.</w:t>
         <w:br/>
       </w:r>
       <w:r>
@@ -179,7 +445,7 @@
           <w:color w:val="202050"/>
           <w:sz w:val="19"/>
         </w:rPr>
-        <w:t>4. Compulsive Creator: a hammer and a chisel crossed over a glowing anvil - steel grey, worn brown, amber glow.</w:t>
+        <w:t>3. Flame - a phoenix feather burning at its tip.</w:t>
         <w:br/>
       </w:r>
       <w:r>
@@ -188,7 +454,7 @@
           <w:color w:val="202050"/>
           <w:sz w:val="19"/>
         </w:rPr>
-        <w:t>5. Energy Architect: a glowing purple stream curling around a small crystal orb like a river of light - purple, pale violet.</w:t>
+        <w:t>4. Moon - a thin crescent moon with a taut bowstring across it.</w:t>
         <w:br/>
       </w:r>
       <w:r>
@@ -197,7 +463,7 @@
           <w:color w:val="202050"/>
           <w:sz w:val="19"/>
         </w:rPr>
-        <w:t>6. Soulmark: a chained human silhouette joined by a thin glowing thread to a small mechanical head - muted grey, dull red thread.</w:t>
+        <w:t>5. Gravity - a falling star pulled into a small ring that bends around it.</w:t>
         <w:br/>
       </w:r>
       <w:r>
@@ -206,7 +472,7 @@
           <w:color w:val="202050"/>
           <w:sz w:val="19"/>
         </w:rPr>
-        <w:t>Bottom row, left to right:</w:t>
+        <w:t>Bottom row = the five great shots, each inside a thin circular rune frame:</w:t>
         <w:br/>
       </w:r>
       <w:r>
@@ -215,7 +481,7 @@
           <w:color w:val="202050"/>
           <w:sz w:val="19"/>
         </w:rPr>
-        <w:t>7. Veil: a round shimmering veil with small bullets stopping against it and sinking in - violet, pale blue, grey.</w:t>
+        <w:t>6. Judgement - a vertical blade of light piercing a ring of runes above a kneeling figure.</w:t>
         <w:br/>
       </w:r>
       <w:r>
@@ -224,7 +490,7 @@
           <w:color w:val="202050"/>
           <w:sz w:val="19"/>
         </w:rPr>
-        <w:t>8. Veil discharge: the veil bursting outward in a violet shockwave ring - violet, white.</w:t>
+        <w:t>7. Sky strike - a bolt of lightning falling from a cloud onto the ground.</w:t>
         <w:br/>
       </w:r>
       <w:r>
@@ -233,28 +499,7 @@
           <w:color w:val="202050"/>
           <w:sz w:val="19"/>
         </w:rPr>
-        <w:t>9. Obsession: three small workbenches side by side with sparks rising from each at once - brown, amber.</w:t>
-      </w:r>
-    </w:p>
-    <w:p>
-      <w:pPr>
-        <w:pStyle w:val="Heading2"/>
-      </w:pPr>
-      <w:r>
-        <w:t>3.2. Ловушки, купол и пламя (лист 5×2)</w:t>
-      </w:r>
-    </w:p>
-    <w:p>
-      <w:pPr>
-        <w:ind w:left="240"/>
-      </w:pPr>
-      <w:r>
-        <w:rPr>
-          <w:rFonts w:ascii="Consolas" w:hAnsi="Consolas"/>
-          <w:color w:val="202050"/>
-          <w:sz w:val="19"/>
-        </w:rPr>
-        <w:t>A sprite sheet of ten separate game ability icons, in a grid of 5 columns and 2 rows, each icon alone in its own equal square cell with clear empty space between cells, on a plain flat medium grey background. STYLE: exactly like RimWorld Ideology ability icons - solid filled heavy shapes with real mass, soft cel shading in three tones, muted slightly dusty colours, no gloss, one very thick black outline around the outer silhouette only, almost no inner lines, compact chunky proportions, each symbol fills about 85 percent of its cell, no texture, no fine detail, readable at 32 pixels. No text, no labels, no grid lines.</w:t>
+        <w:t>8. Fire rain - many burning arrows falling from above in slanted lines.</w:t>
         <w:br/>
       </w:r>
       <w:r>
@@ -263,7 +508,7 @@
           <w:color w:val="202050"/>
           <w:sz w:val="19"/>
         </w:rPr>
-        <w:t>Top row, left to right:</w:t>
+        <w:t>9. Moon arrow - one arrow crossing the full disc of the moon, leaving a long trail of light.</w:t>
         <w:br/>
       </w:r>
       <w:r>
@@ -272,97 +517,7 @@
           <w:color w:val="202050"/>
           <w:sz w:val="19"/>
         </w:rPr>
-        <w:t>1. A rune disc pulling small arrows inward to its centre like a whirlpool - violet, dark grey.</w:t>
-        <w:br/>
-      </w:r>
-      <w:r>
-        <w:rPr>
-          <w:rFonts w:ascii="Consolas" w:hAnsi="Consolas"/>
-          <w:color w:val="202050"/>
-          <w:sz w:val="19"/>
-        </w:rPr>
-        <w:t>2. A rune disc with a jagged bolt rising from it - pale blue, white.</w:t>
-        <w:br/>
-      </w:r>
-      <w:r>
-        <w:rPr>
-          <w:rFonts w:ascii="Consolas" w:hAnsi="Consolas"/>
-          <w:color w:val="202050"/>
-          <w:sz w:val="19"/>
-        </w:rPr>
-        <w:t>3. A rune disc bursting into golden flame - gold, orange, dark grey.</w:t>
-        <w:br/>
-      </w:r>
-      <w:r>
-        <w:rPr>
-          <w:rFonts w:ascii="Consolas" w:hAnsi="Consolas"/>
-          <w:color w:val="202050"/>
-          <w:sz w:val="19"/>
-        </w:rPr>
-        <w:t>4. A rune disc bursting into sharp ice shards - icy blue, white.</w:t>
-        <w:br/>
-      </w:r>
-      <w:r>
-        <w:rPr>
-          <w:rFonts w:ascii="Consolas" w:hAnsi="Consolas"/>
-          <w:color w:val="202050"/>
-          <w:sz w:val="19"/>
-        </w:rPr>
-        <w:t>5. A rune disc bursting in a plain round blast of smoke and debris - grey, dull orange.</w:t>
-        <w:br/>
-      </w:r>
-      <w:r>
-        <w:rPr>
-          <w:rFonts w:ascii="Consolas" w:hAnsi="Consolas"/>
-          <w:color w:val="202050"/>
-          <w:sz w:val="19"/>
-        </w:rPr>
-        <w:t>Bottom row, left to right:</w:t>
-        <w:br/>
-      </w:r>
-      <w:r>
-        <w:rPr>
-          <w:rFonts w:ascii="Consolas" w:hAnsi="Consolas"/>
-          <w:color w:val="202050"/>
-          <w:sz w:val="19"/>
-        </w:rPr>
-        <w:t>6. A rune disc bursting into a blinding white star with sound rings around it - white, pale yellow.</w:t>
-        <w:br/>
-      </w:r>
-      <w:r>
-        <w:rPr>
-          <w:rFonts w:ascii="Consolas" w:hAnsi="Consolas"/>
-          <w:color w:val="202050"/>
-          <w:sz w:val="19"/>
-        </w:rPr>
-        <w:t>7. A wide shimmering dome over a small patch of ground - warm gold, pale yellow.</w:t>
-        <w:br/>
-      </w:r>
-      <w:r>
-        <w:rPr>
-          <w:rFonts w:ascii="Consolas" w:hAnsi="Consolas"/>
-          <w:color w:val="202050"/>
-          <w:sz w:val="19"/>
-        </w:rPr>
-        <w:t>8. A falling column of golden fire striking the ground - gold, warm yellow.</w:t>
-        <w:br/>
-      </w:r>
-      <w:r>
-        <w:rPr>
-          <w:rFonts w:ascii="Consolas" w:hAnsi="Consolas"/>
-          <w:color w:val="202050"/>
-          <w:sz w:val="19"/>
-        </w:rPr>
-        <w:t>9. A falling column of silver-white moonfire striking the ground - silver, pale blue.</w:t>
-        <w:br/>
-      </w:r>
-      <w:r>
-        <w:rPr>
-          <w:rFonts w:ascii="Consolas" w:hAnsi="Consolas"/>
-          <w:color w:val="202050"/>
-          <w:sz w:val="19"/>
-        </w:rPr>
-        <w:t>10. A plain round blast with debris, no fire - grey, dull orange.</w:t>
+        <w:t>10. Gravity knot - several small figures pulled together into a knot of rings.</w:t>
       </w:r>
     </w:p>
     <w:p>
@@ -370,146 +525,12 @@
         <w:pStyle w:val="Heading1"/>
       </w:pPr>
       <w:r>
-        <w:t>4. Иконки путей Страйдеров (лист 5×2)</w:t>
+        <w:t>4. Эффекты (лист 3×3)</w:t>
       </w:r>
     </w:p>
     <w:p>
       <w:r>
-        <w:t>Верхний ряд — пять путей лука, нижний — их активки на 18 камнях.</w:t>
-      </w:r>
-    </w:p>
-    <w:p>
-      <w:pPr>
-        <w:ind w:left="240"/>
-      </w:pPr>
-      <w:r>
-        <w:rPr>
-          <w:rFonts w:ascii="Consolas" w:hAnsi="Consolas"/>
-          <w:color w:val="202050"/>
-          <w:sz w:val="19"/>
-        </w:rPr>
-        <w:t>A sprite sheet of ten separate game ability icons, in a grid of 5 columns and 2 rows, each icon alone in its own equal square cell with clear empty space between cells, on a plain flat medium grey background. STYLE: exactly like RimWorld Ideology ability icons - solid filled heavy shapes with real mass, soft cel shading in three tones, muted slightly dusty colours, no gloss, one very thick black outline around the outer silhouette only, almost no inner lines, compact chunky proportions, each symbol fills about 85 percent of its cell, no texture, no fine detail, readable at 32 pixels. No text, no labels, no grid lines.</w:t>
-        <w:br/>
-      </w:r>
-      <w:r>
-        <w:rPr>
-          <w:rFonts w:ascii="Consolas" w:hAnsi="Consolas"/>
-          <w:color w:val="202050"/>
-          <w:sz w:val="19"/>
-        </w:rPr>
-        <w:t>Top row, the five paths of a longbow, left to right:</w:t>
-        <w:br/>
-      </w:r>
-      <w:r>
-        <w:rPr>
-          <w:rFonts w:ascii="Consolas" w:hAnsi="Consolas"/>
-          <w:color w:val="202050"/>
-          <w:sz w:val="19"/>
-        </w:rPr>
-        <w:t>1. Hunt: three claw slashes behind an arrowhead - muted dark red, bone white.</w:t>
-        <w:br/>
-      </w:r>
-      <w:r>
-        <w:rPr>
-          <w:rFonts w:ascii="Consolas" w:hAnsi="Consolas"/>
-          <w:color w:val="202050"/>
-          <w:sz w:val="19"/>
-        </w:rPr>
-        <w:t>2. Storm: an arrow wrapped in a crackling bolt - pale blue, white.</w:t>
-        <w:br/>
-      </w:r>
-      <w:r>
-        <w:rPr>
-          <w:rFonts w:ascii="Consolas" w:hAnsi="Consolas"/>
-          <w:color w:val="202050"/>
-          <w:sz w:val="19"/>
-        </w:rPr>
-        <w:t>3. Flame: a burning arrow - orange, gold.</w:t>
-        <w:br/>
-      </w:r>
-      <w:r>
-        <w:rPr>
-          <w:rFonts w:ascii="Consolas" w:hAnsi="Consolas"/>
-          <w:color w:val="202050"/>
-          <w:sz w:val="19"/>
-        </w:rPr>
-        <w:t>4. Moon: an arrow crossing a thin crescent moon - silver, pale blue.</w:t>
-        <w:br/>
-      </w:r>
-      <w:r>
-        <w:rPr>
-          <w:rFonts w:ascii="Consolas" w:hAnsi="Consolas"/>
-          <w:color w:val="202050"/>
-          <w:sz w:val="19"/>
-        </w:rPr>
-        <w:t>5. Gravity: an arrow spiralling into a small dark vortex - violet, dark grey.</w:t>
-        <w:br/>
-      </w:r>
-      <w:r>
-        <w:rPr>
-          <w:rFonts w:ascii="Consolas" w:hAnsi="Consolas"/>
-          <w:color w:val="202050"/>
-          <w:sz w:val="19"/>
-        </w:rPr>
-        <w:t>Bottom row, the five great shots, left to right:</w:t>
-        <w:br/>
-      </w:r>
-      <w:r>
-        <w:rPr>
-          <w:rFonts w:ascii="Consolas" w:hAnsi="Consolas"/>
-          <w:color w:val="202050"/>
-          <w:sz w:val="19"/>
-        </w:rPr>
-        <w:t>6. Judgement: a vertical blade of light piercing a ring of runes above a kneeling silhouette - warm gold, white.</w:t>
-        <w:br/>
-      </w:r>
-      <w:r>
-        <w:rPr>
-          <w:rFonts w:ascii="Consolas" w:hAnsi="Consolas"/>
-          <w:color w:val="202050"/>
-          <w:sz w:val="19"/>
-        </w:rPr>
-        <w:t>7. Sky strike: a bolt of lightning falling from a cloud onto the ground - pale blue, white, grey.</w:t>
-        <w:br/>
-      </w:r>
-      <w:r>
-        <w:rPr>
-          <w:rFonts w:ascii="Consolas" w:hAnsi="Consolas"/>
-          <w:color w:val="202050"/>
-          <w:sz w:val="19"/>
-        </w:rPr>
-        <w:t>8. Fire rain: many burning arrows falling from above - orange, gold.</w:t>
-        <w:br/>
-      </w:r>
-      <w:r>
-        <w:rPr>
-          <w:rFonts w:ascii="Consolas" w:hAnsi="Consolas"/>
-          <w:color w:val="202050"/>
-          <w:sz w:val="19"/>
-        </w:rPr>
-        <w:t>9. Moon arrow: a long beam of silver light crossing a full moon - silver, pale blue.</w:t>
-        <w:br/>
-      </w:r>
-      <w:r>
-        <w:rPr>
-          <w:rFonts w:ascii="Consolas" w:hAnsi="Consolas"/>
-          <w:color w:val="202050"/>
-          <w:sz w:val="19"/>
-        </w:rPr>
-        <w:t>10. Gravity knot: several small figures pulled into a knot of violet rings - violet, dark grey.</w:t>
-      </w:r>
-    </w:p>
-    <w:p>
-      <w:pPr>
-        <w:pStyle w:val="Heading1"/>
-      </w:pPr>
-      <w:r>
-        <w:t>5. Эффекты (лист 3×3)</w:t>
-      </w:r>
-    </w:p>
-    <w:p>
-      <w:r>
-        <w:t>Только белые и светло-серые, чтобы игра красила их сама. Это заменит мои временные заготовки.</w:t>
+        <w:t>Без изменений с прошлого раза. Это то, что видно в игре при срабатывании, а не иконки. Только белое и светло-серое, цвет игра даст сама.</w:t>
       </w:r>
     </w:p>
     <w:p>
@@ -688,53 +709,7 @@
         <w:pStyle w:val="ListBullet"/>
       </w:pPr>
       <w:r>
-        <w:t xml:space="preserve">Сферы → </w:t>
-      </w:r>
-      <w:r>
-        <w:rPr>
-          <w:rFonts w:ascii="Consolas" w:hAnsi="Consolas"/>
-          <w:sz w:val="20"/>
-        </w:rPr>
-        <w:t>Things/Item/Artifactorics/Avir_ArchitectSpheres</w:t>
-      </w:r>
-      <w:r>
-        <w:t>.</w:t>
-      </w:r>
-    </w:p>
-    <w:p>
-      <w:pPr>
-        <w:pStyle w:val="ListBullet"/>
-      </w:pPr>
-      <w:r>
-        <w:t xml:space="preserve">Глифы → </w:t>
-      </w:r>
-      <w:r>
-        <w:rPr>
-          <w:rFonts w:ascii="Consolas" w:hAnsi="Consolas"/>
-          <w:sz w:val="20"/>
-        </w:rPr>
-        <w:t>UI/Ritualistics/Runes/Ink|Glow/Rune_Blood</w:t>
-      </w:r>
-      <w:r>
-        <w:t xml:space="preserve">, </w:t>
-      </w:r>
-      <w:r>
-        <w:rPr>
-          <w:rFonts w:ascii="Consolas" w:hAnsi="Consolas"/>
-          <w:sz w:val="20"/>
-        </w:rPr>
-        <w:t>Rune_Shroud</w:t>
-      </w:r>
-      <w:r>
-        <w:t>.</w:t>
-      </w:r>
-    </w:p>
-    <w:p>
-      <w:pPr>
-        <w:pStyle w:val="ListBullet"/>
-      </w:pPr>
-      <w:r>
-        <w:t xml:space="preserve">Архитекты, лист 3.1 → </w:t>
+        <w:t xml:space="preserve">Лист 1 → </w:t>
       </w:r>
       <w:r>
         <w:rPr>
@@ -842,7 +817,7 @@
         <w:pStyle w:val="ListBullet"/>
       </w:pPr>
       <w:r>
-        <w:t xml:space="preserve">Архитекты, лист 3.2 → </w:t>
+        <w:t xml:space="preserve">Лист 2 → </w:t>
       </w:r>
       <w:r>
         <w:rPr>
@@ -960,7 +935,7 @@
         <w:pStyle w:val="ListBullet"/>
       </w:pPr>
       <w:r>
-        <w:t xml:space="preserve">Страйдеры → </w:t>
+        <w:t xml:space="preserve">Лист 3 → </w:t>
       </w:r>
       <w:r>
         <w:rPr>
@@ -998,7 +973,7 @@
         <w:pStyle w:val="ListBullet"/>
       </w:pPr>
       <w:r>
-        <w:t xml:space="preserve">Эффекты → </w:t>
+        <w:t xml:space="preserve">Лист 4 → </w:t>
       </w:r>
       <w:r>
         <w:rPr>

</xml_diff>